<commit_message>
try docxtemplater and gdrive
</commit_message>
<xml_diff>
--- a/sources/template_comanda_materiale.docx
+++ b/sources/template_comanda_materiale.docx
@@ -1227,20 +1227,6 @@
           </w:tcPr>
           <w:p>
             <w:pPr>
-              <w:keepNext w:val="0"/>
-              <w:keepLines w:val="0"/>
-              <w:pageBreakBefore w:val="0"/>
-              <w:widowControl w:val="1"/>
-              <w:pBdr>
-                <w:top w:space="0" w:sz="0" w:val="nil"/>
-                <w:left w:space="0" w:sz="0" w:val="nil"/>
-                <w:bottom w:space="0" w:sz="0" w:val="nil"/>
-                <w:right w:space="0" w:sz="0" w:val="nil"/>
-                <w:between w:space="0" w:sz="0" w:val="nil"/>
-              </w:pBdr>
-              <w:shd w:fill="auto" w:val="clear"/>
-              <w:spacing w:after="0" w:before="0" w:line="240" w:lineRule="auto"/>
-              <w:ind w:left="720" w:right="0" w:firstLine="0"/>
               <w:jc w:val="center"/>
               <w:rPr>
                 <w:rFonts w:ascii="Times New Roman" w:cs="Times New Roman" w:eastAsia="Times New Roman" w:hAnsi="Times New Roman"/>
@@ -1260,22 +1246,14 @@
             </w:pPr>
             <w:r>
               <w:rPr>
-                <w:rFonts w:ascii="Times New Roman" w:cs="Times New Roman" w:eastAsia="Times New Roman" w:hAnsi="Times New Roman"/>
-                <w:b w:val="0"/>
-                <w:bCs w:val="0"/>
-                <w:i w:val="0"/>
-                <w:iCs w:val="0"/>
-                <w:smallCaps w:val="0"/>
-                <w:strike w:val="0"/>
-                <w:color w:val="000000"/>
-                <w:sz w:val="24"/>
-                <w:szCs w:val="24"/>
-                <w:u w:val="none"/>
-                <w:shd w:fill="auto" w:val="clear"/>
-                <w:vertAlign w:val="baseline"/>
-                <w:rtl w:val="0"/>
-              </w:rPr>
-              <w:t xml:space="preserve">1</w:t>
+                <w:rtl w:val="0"/>
+              </w:rPr>
+              <w:t xml:space="preserve">{#materiale}{nr}</w:t>
+            </w:r>
+            <w:r>
+              <w:rPr>
+                <w:rtl w:val="0"/>
+              </w:rPr>
             </w:r>
           </w:p>
         </w:tc>
@@ -1303,7 +1281,7 @@
               <w:rPr>
                 <w:rtl w:val="0"/>
               </w:rPr>
-              <w:t xml:space="preserve">{name}</w:t>
+              <w:t xml:space="preserve">{nume}</w:t>
             </w:r>
             <w:r>
               <w:rPr>
@@ -1392,7 +1370,7 @@
               <w:rPr>
                 <w:rtl w:val="0"/>
               </w:rPr>
-              <w:t xml:space="preserve">{unit}</w:t>
+              <w:t xml:space="preserve">{um}</w:t>
             </w:r>
             <w:r>
               <w:rPr>
@@ -1421,7 +1399,7 @@
               <w:rPr>
                 <w:rtl w:val="0"/>
               </w:rPr>
-              <w:t xml:space="preserve">{quantity}</w:t>
+              <w:t xml:space="preserve">{cant}</w:t>
             </w:r>
             <w:r>
               <w:rPr>
@@ -1473,6 +1451,12 @@
                 <w:vertAlign w:val="baseline"/>
               </w:rPr>
             </w:pPr>
+            <w:r>
+              <w:rPr>
+                <w:rtl w:val="0"/>
+              </w:rPr>
+              <w:t xml:space="preserve">{cod}{/}</w:t>
+            </w:r>
             <w:r>
               <w:rPr>
                 <w:rtl w:val="0"/>
@@ -1511,8 +1495,8 @@
               </w:pBdr>
               <w:shd w:fill="auto" w:val="clear"/>
               <w:spacing w:after="0" w:before="0" w:line="240" w:lineRule="auto"/>
-              <w:ind w:left="720" w:right="0" w:firstLine="0"/>
-              <w:jc w:val="center"/>
+              <w:ind w:left="0" w:right="0" w:firstLine="0"/>
+              <w:jc w:val="left"/>
               <w:rPr>
                 <w:rFonts w:ascii="Times New Roman" w:cs="Times New Roman" w:eastAsia="Times New Roman" w:hAnsi="Times New Roman"/>
                 <w:b w:val="0"/>
@@ -1747,8 +1731,8 @@
               </w:pBdr>
               <w:shd w:fill="auto" w:val="clear"/>
               <w:spacing w:after="0" w:before="0" w:line="240" w:lineRule="auto"/>
-              <w:ind w:left="720" w:right="0" w:firstLine="0"/>
-              <w:jc w:val="center"/>
+              <w:ind w:left="0" w:right="0" w:firstLine="0"/>
+              <w:jc w:val="left"/>
               <w:rPr>
                 <w:rFonts w:ascii="Times New Roman" w:cs="Times New Roman" w:eastAsia="Times New Roman" w:hAnsi="Times New Roman"/>
                 <w:b w:val="0"/>

</xml_diff>